<commit_message>
red flag schools updated
</commit_message>
<xml_diff>
--- a/src/data/Red Flag Ranking.docx
+++ b/src/data/Red Flag Ranking.docx
@@ -4,24 +4,454 @@
   <w:body>
     <w:p>
       <w:pPr>
-        <w:rPr/>
-      </w:pPr>
-      <w:r>
-        <w:rPr>
-          <w:rtl w:val="0"/>
-        </w:rPr>
-        <w:t xml:space="preserve">CCRC College (nothing for now)</w:t>
-      </w:r>
-    </w:p>
-    <w:p>
-      <w:pPr>
-        <w:rPr/>
-      </w:pPr>
-      <w:r>
-        <w:rPr>
+        <w:pStyle w:val="Heading3"/>
+        <w:keepNext w:val="0"/>
+        <w:keepLines w:val="0"/>
+        <w:spacing w:before="280" w:lineRule="auto"/>
+        <w:rPr>
+          <w:b w:val="1"/>
+          <w:bCs w:val="1"/>
+          <w:color w:val="000000"/>
+          <w:sz w:val="26"/>
+          <w:szCs w:val="26"/>
+        </w:rPr>
+      </w:pPr>
+      <w:bookmarkStart w:colFirst="0" w:colLast="0" w:name="_oapthhwnwo7j" w:id="0"/>
+      <w:bookmarkEnd w:id="0"/>
+      <w:r>
+        <w:rPr>
+          <w:b w:val="1"/>
+          <w:bCs w:val="1"/>
+          <w:color w:val="000000"/>
+          <w:sz w:val="26"/>
+          <w:szCs w:val="26"/>
           <w:rtl w:val="0"/>
         </w:rPr>
         <w:t xml:space="preserve">Budhanilkantha School</w:t>
+      </w:r>
+    </w:p>
+    <w:p>
+      <w:pPr>
+        <w:numPr>
+          <w:ilvl w:val="0"/>
+          <w:numId w:val="8"/>
+        </w:numPr>
+        <w:spacing w:after="240" w:before="240" w:lineRule="auto"/>
+        <w:ind w:left="720" w:hanging="360"/>
+      </w:pPr>
+      <w:r>
+        <w:rPr>
+          <w:rtl w:val="0"/>
+        </w:rPr>
+        <w:t xml:space="preserve">Reports of a hostel environment characterized by bullying and intimidation.</w:t>
+      </w:r>
+    </w:p>
+    <w:p>
+      <w:pPr>
+        <w:pStyle w:val="Heading3"/>
+        <w:keepNext w:val="0"/>
+        <w:keepLines w:val="0"/>
+        <w:spacing w:before="280" w:lineRule="auto"/>
+        <w:rPr>
+          <w:b w:val="1"/>
+          <w:bCs w:val="1"/>
+          <w:color w:val="000000"/>
+          <w:sz w:val="26"/>
+          <w:szCs w:val="26"/>
+        </w:rPr>
+      </w:pPr>
+      <w:bookmarkStart w:colFirst="0" w:colLast="0" w:name="_spt97al3gfta" w:id="1"/>
+      <w:bookmarkEnd w:id="1"/>
+      <w:r>
+        <w:rPr>
+          <w:b w:val="1"/>
+          <w:bCs w:val="1"/>
+          <w:color w:val="000000"/>
+          <w:sz w:val="26"/>
+          <w:szCs w:val="26"/>
+          <w:rtl w:val="0"/>
+        </w:rPr>
+        <w:t xml:space="preserve">United Academy</w:t>
+      </w:r>
+    </w:p>
+    <w:p>
+      <w:pPr>
+        <w:numPr>
+          <w:ilvl w:val="0"/>
+          <w:numId w:val="7"/>
+        </w:numPr>
+        <w:spacing w:after="0" w:afterAutospacing="0" w:before="240" w:lineRule="auto"/>
+        <w:ind w:left="720" w:hanging="360"/>
+      </w:pPr>
+      <w:r>
+        <w:rPr>
+          <w:rtl w:val="0"/>
+        </w:rPr>
+        <w:t xml:space="preserve">Reports of severe physical punishment allegedly imposed for disciplinary offences that had not been verified.</w:t>
+      </w:r>
+    </w:p>
+    <w:p>
+      <w:pPr>
+        <w:numPr>
+          <w:ilvl w:val="0"/>
+          <w:numId w:val="7"/>
+        </w:numPr>
+        <w:spacing w:after="240" w:before="0" w:beforeAutospacing="0" w:lineRule="auto"/>
+        <w:ind w:left="720" w:hanging="360"/>
+      </w:pPr>
+      <w:r>
+        <w:rPr>
+          <w:rtl w:val="0"/>
+        </w:rPr>
+        <w:t xml:space="preserve">Reports of disciplinary action for alleged school-rule violations occurring outside school premises.</w:t>
+      </w:r>
+    </w:p>
+    <w:p>
+      <w:pPr>
+        <w:pStyle w:val="Heading3"/>
+        <w:keepNext w:val="0"/>
+        <w:keepLines w:val="0"/>
+        <w:spacing w:before="280" w:lineRule="auto"/>
+        <w:rPr>
+          <w:b w:val="1"/>
+          <w:bCs w:val="1"/>
+          <w:color w:val="000000"/>
+          <w:sz w:val="26"/>
+          <w:szCs w:val="26"/>
+        </w:rPr>
+      </w:pPr>
+      <w:bookmarkStart w:colFirst="0" w:colLast="0" w:name="_ew08467soorz" w:id="2"/>
+      <w:bookmarkEnd w:id="2"/>
+      <w:r>
+        <w:rPr>
+          <w:b w:val="1"/>
+          <w:bCs w:val="1"/>
+          <w:color w:val="000000"/>
+          <w:sz w:val="26"/>
+          <w:szCs w:val="26"/>
+          <w:rtl w:val="0"/>
+        </w:rPr>
+        <w:t xml:space="preserve">KMC Bagbazar</w:t>
+      </w:r>
+    </w:p>
+    <w:p>
+      <w:pPr>
+        <w:numPr>
+          <w:ilvl w:val="0"/>
+          <w:numId w:val="2"/>
+        </w:numPr>
+        <w:spacing w:after="0" w:afterAutospacing="0" w:before="240" w:lineRule="auto"/>
+        <w:ind w:left="720" w:hanging="360"/>
+      </w:pPr>
+      <w:r>
+        <w:rPr>
+          <w:rtl w:val="0"/>
+        </w:rPr>
+        <w:t xml:space="preserve">Reports of physical punishment for minor disciplinary infractions, including using the washroom during class.</w:t>
+      </w:r>
+    </w:p>
+    <w:p>
+      <w:pPr>
+        <w:numPr>
+          <w:ilvl w:val="0"/>
+          <w:numId w:val="2"/>
+        </w:numPr>
+        <w:spacing w:after="0" w:afterAutospacing="0" w:before="0" w:beforeAutospacing="0" w:lineRule="auto"/>
+        <w:ind w:left="720" w:hanging="360"/>
+      </w:pPr>
+      <w:r>
+        <w:rPr>
+          <w:rtl w:val="0"/>
+        </w:rPr>
+        <w:t xml:space="preserve">Reports of public humiliation and verbal abuse, including an allegation that a student was publicly called a “whore.”</w:t>
+      </w:r>
+    </w:p>
+    <w:p>
+      <w:pPr>
+        <w:numPr>
+          <w:ilvl w:val="0"/>
+          <w:numId w:val="2"/>
+        </w:numPr>
+        <w:spacing w:after="0" w:afterAutospacing="0" w:before="0" w:beforeAutospacing="0" w:lineRule="auto"/>
+        <w:ind w:left="720" w:hanging="360"/>
+      </w:pPr>
+      <w:r>
+        <w:rPr>
+          <w:rtl w:val="0"/>
+        </w:rPr>
+        <w:t xml:space="preserve">Reports of sexual assault and sexual coercion allegedly involving school authorities, including allegations concerning female students.</w:t>
+      </w:r>
+    </w:p>
+    <w:p>
+      <w:pPr>
+        <w:numPr>
+          <w:ilvl w:val="0"/>
+          <w:numId w:val="2"/>
+        </w:numPr>
+        <w:spacing w:after="0" w:afterAutospacing="0" w:before="0" w:beforeAutospacing="0" w:lineRule="auto"/>
+        <w:ind w:left="720" w:hanging="360"/>
+      </w:pPr>
+      <w:r>
+        <w:rPr>
+          <w:rtl w:val="0"/>
+        </w:rPr>
+        <w:t xml:space="preserve">Reports of students being verbally abused over family-related circumstances.</w:t>
+      </w:r>
+    </w:p>
+    <w:p>
+      <w:pPr>
+        <w:numPr>
+          <w:ilvl w:val="0"/>
+          <w:numId w:val="2"/>
+        </w:numPr>
+        <w:spacing w:after="0" w:afterAutospacing="0" w:before="0" w:beforeAutospacing="0" w:lineRule="auto"/>
+        <w:ind w:left="720" w:hanging="360"/>
+      </w:pPr>
+      <w:r>
+        <w:rPr>
+          <w:rtl w:val="0"/>
+        </w:rPr>
+        <w:t xml:space="preserve">Reports of intrusive monitoring of students’ private lives and disciplinary action over alleged makeup use.</w:t>
+      </w:r>
+    </w:p>
+    <w:p>
+      <w:pPr>
+        <w:numPr>
+          <w:ilvl w:val="0"/>
+          <w:numId w:val="2"/>
+        </w:numPr>
+        <w:spacing w:after="0" w:afterAutospacing="0" w:before="0" w:beforeAutospacing="0" w:lineRule="auto"/>
+        <w:ind w:left="720" w:hanging="360"/>
+      </w:pPr>
+      <w:r>
+        <w:rPr>
+          <w:rtl w:val="0"/>
+        </w:rPr>
+        <w:t xml:space="preserve">Reports of sexual misconduct by teachers, including alleged sexual assault of female students and the sending of inappropriate images through private messages. Allegations involving minors warrant particular scrutiny and appropriate safeguarding action.</w:t>
+      </w:r>
+    </w:p>
+    <w:p>
+      <w:pPr>
+        <w:numPr>
+          <w:ilvl w:val="0"/>
+          <w:numId w:val="2"/>
+        </w:numPr>
+        <w:spacing w:after="240" w:before="0" w:beforeAutospacing="0" w:lineRule="auto"/>
+        <w:ind w:left="720" w:hanging="360"/>
+      </w:pPr>
+      <w:r>
+        <w:rPr>
+          <w:rtl w:val="0"/>
+        </w:rPr>
+        <w:t xml:space="preserve">Reports of teaching practices that discourage curiosity and rely heavily on rote memorization.</w:t>
+      </w:r>
+    </w:p>
+    <w:p>
+      <w:pPr>
+        <w:pStyle w:val="Heading3"/>
+        <w:keepNext w:val="0"/>
+        <w:keepLines w:val="0"/>
+        <w:spacing w:before="280" w:lineRule="auto"/>
+        <w:rPr>
+          <w:b w:val="1"/>
+          <w:bCs w:val="1"/>
+          <w:color w:val="000000"/>
+          <w:sz w:val="26"/>
+          <w:szCs w:val="26"/>
+        </w:rPr>
+      </w:pPr>
+      <w:bookmarkStart w:colFirst="0" w:colLast="0" w:name="_s5mjrmoba8ld" w:id="3"/>
+      <w:bookmarkEnd w:id="3"/>
+      <w:r>
+        <w:rPr>
+          <w:b w:val="1"/>
+          <w:bCs w:val="1"/>
+          <w:color w:val="000000"/>
+          <w:sz w:val="26"/>
+          <w:szCs w:val="26"/>
+          <w:rtl w:val="0"/>
+        </w:rPr>
+        <w:t xml:space="preserve">St. Mary’s</w:t>
+      </w:r>
+    </w:p>
+    <w:p>
+      <w:pPr>
+        <w:numPr>
+          <w:ilvl w:val="0"/>
+          <w:numId w:val="9"/>
+        </w:numPr>
+        <w:spacing w:after="0" w:afterAutospacing="0" w:before="240" w:lineRule="auto"/>
+        <w:ind w:left="720" w:hanging="360"/>
+      </w:pPr>
+      <w:r>
+        <w:rPr>
+          <w:rtl w:val="0"/>
+        </w:rPr>
+        <w:t xml:space="preserve">Reports of restrictive dress codes and alleged physical punishment associated with their enforcement.</w:t>
+      </w:r>
+    </w:p>
+    <w:p>
+      <w:pPr>
+        <w:numPr>
+          <w:ilvl w:val="0"/>
+          <w:numId w:val="9"/>
+        </w:numPr>
+        <w:spacing w:after="0" w:afterAutospacing="0" w:before="0" w:beforeAutospacing="0" w:lineRule="auto"/>
+        <w:ind w:left="720" w:hanging="360"/>
+      </w:pPr>
+      <w:r>
+        <w:rPr>
+          <w:rtl w:val="0"/>
+        </w:rPr>
+        <w:t xml:space="preserve">Reports of practices raising concerns about student privacy and children’s rights.</w:t>
+      </w:r>
+    </w:p>
+    <w:p>
+      <w:pPr>
+        <w:numPr>
+          <w:ilvl w:val="0"/>
+          <w:numId w:val="9"/>
+        </w:numPr>
+        <w:spacing w:after="0" w:afterAutospacing="0" w:before="0" w:beforeAutospacing="0" w:lineRule="auto"/>
+        <w:ind w:left="720" w:hanging="360"/>
+      </w:pPr>
+      <w:r>
+        <w:rPr>
+          <w:rtl w:val="0"/>
+        </w:rPr>
+        <w:t xml:space="preserve">Reports of religious instruction or practices alleged to exert undue influence on students’ beliefs.</w:t>
+      </w:r>
+    </w:p>
+    <w:p>
+      <w:pPr>
+        <w:numPr>
+          <w:ilvl w:val="0"/>
+          <w:numId w:val="9"/>
+        </w:numPr>
+        <w:spacing w:after="240" w:before="0" w:beforeAutospacing="0" w:lineRule="auto"/>
+        <w:ind w:left="720" w:hanging="360"/>
+      </w:pPr>
+      <w:r>
+        <w:rPr>
+          <w:rtl w:val="0"/>
+        </w:rPr>
+        <w:t xml:space="preserve">Reports of restrictions on male-female interaction extending beyond school premises.</w:t>
+      </w:r>
+    </w:p>
+    <w:p>
+      <w:pPr>
+        <w:pStyle w:val="Heading3"/>
+        <w:keepNext w:val="0"/>
+        <w:keepLines w:val="0"/>
+        <w:spacing w:before="280" w:lineRule="auto"/>
+        <w:rPr>
+          <w:b w:val="1"/>
+          <w:bCs w:val="1"/>
+          <w:color w:val="000000"/>
+          <w:sz w:val="26"/>
+          <w:szCs w:val="26"/>
+        </w:rPr>
+      </w:pPr>
+      <w:bookmarkStart w:colFirst="0" w:colLast="0" w:name="_gvdkpl80g4rp" w:id="4"/>
+      <w:bookmarkEnd w:id="4"/>
+      <w:r>
+        <w:rPr>
+          <w:b w:val="1"/>
+          <w:bCs w:val="1"/>
+          <w:color w:val="000000"/>
+          <w:sz w:val="26"/>
+          <w:szCs w:val="26"/>
+          <w:rtl w:val="0"/>
+        </w:rPr>
+        <w:t xml:space="preserve">GEMS</w:t>
+      </w:r>
+    </w:p>
+    <w:p>
+      <w:pPr>
+        <w:numPr>
+          <w:ilvl w:val="0"/>
+          <w:numId w:val="3"/>
+        </w:numPr>
+        <w:spacing w:after="240" w:before="240" w:lineRule="auto"/>
+        <w:ind w:left="720" w:hanging="360"/>
+      </w:pPr>
+      <w:r>
+        <w:rPr>
+          <w:rtl w:val="0"/>
+        </w:rPr>
+        <w:t xml:space="preserve">Reports of physical bullying or physical mistreatment by teachers.</w:t>
+      </w:r>
+    </w:p>
+    <w:p>
+      <w:pPr>
+        <w:pStyle w:val="Heading3"/>
+        <w:keepNext w:val="0"/>
+        <w:keepLines w:val="0"/>
+        <w:spacing w:before="280" w:lineRule="auto"/>
+        <w:rPr>
+          <w:b w:val="1"/>
+          <w:bCs w:val="1"/>
+          <w:color w:val="000000"/>
+          <w:sz w:val="26"/>
+          <w:szCs w:val="26"/>
+        </w:rPr>
+      </w:pPr>
+      <w:bookmarkStart w:colFirst="0" w:colLast="0" w:name="_bjhr2vv0c5o5" w:id="5"/>
+      <w:bookmarkEnd w:id="5"/>
+      <w:r>
+        <w:rPr>
+          <w:b w:val="1"/>
+          <w:bCs w:val="1"/>
+          <w:color w:val="000000"/>
+          <w:sz w:val="26"/>
+          <w:szCs w:val="26"/>
+          <w:rtl w:val="0"/>
+        </w:rPr>
+        <w:t xml:space="preserve">Kavya</w:t>
+      </w:r>
+    </w:p>
+    <w:p>
+      <w:pPr>
+        <w:numPr>
+          <w:ilvl w:val="0"/>
+          <w:numId w:val="6"/>
+        </w:numPr>
+        <w:spacing w:after="240" w:before="240" w:lineRule="auto"/>
+        <w:ind w:left="720" w:hanging="360"/>
+      </w:pPr>
+      <w:r>
+        <w:rPr>
+          <w:rtl w:val="0"/>
+        </w:rPr>
+        <w:t xml:space="preserve">Reports of staff allegedly physically beating students and making verbal threats.</w:t>
+      </w:r>
+    </w:p>
+    <w:p>
+      <w:pPr>
+        <w:pStyle w:val="Heading3"/>
+        <w:keepNext w:val="0"/>
+        <w:keepLines w:val="0"/>
+        <w:spacing w:before="280" w:lineRule="auto"/>
+        <w:rPr>
+          <w:b w:val="1"/>
+          <w:bCs w:val="1"/>
+          <w:color w:val="000000"/>
+          <w:sz w:val="26"/>
+          <w:szCs w:val="26"/>
+        </w:rPr>
+      </w:pPr>
+      <w:bookmarkStart w:colFirst="0" w:colLast="0" w:name="_c171e878xebh" w:id="6"/>
+      <w:bookmarkEnd w:id="6"/>
+      <w:r>
+        <w:rPr>
+          <w:b w:val="1"/>
+          <w:bCs w:val="1"/>
+          <w:color w:val="000000"/>
+          <w:sz w:val="26"/>
+          <w:szCs w:val="26"/>
+          <w:rtl w:val="0"/>
+        </w:rPr>
+        <w:t xml:space="preserve">DAV</w:t>
       </w:r>
     </w:p>
     <w:p>
@@ -30,94 +460,102 @@
           <w:ilvl w:val="0"/>
           <w:numId w:val="4"/>
         </w:numPr>
-        <w:ind w:left="720" w:hanging="360"/>
-        <w:rPr>
-          <w:u w:val="none"/>
-        </w:rPr>
-      </w:pPr>
-      <w:r>
-        <w:rPr>
-          <w:rtl w:val="0"/>
-        </w:rPr>
-        <w:t xml:space="preserve">Hostel bullying environment</w:t>
-      </w:r>
-    </w:p>
-    <w:p>
-      <w:pPr>
-        <w:rPr/>
-      </w:pPr>
-      <w:r>
-        <w:rPr>
-          <w:rtl w:val="0"/>
-        </w:rPr>
-      </w:r>
-    </w:p>
-    <w:p>
-      <w:pPr>
-        <w:rPr/>
-      </w:pPr>
-      <w:r>
-        <w:rPr>
-          <w:rtl w:val="0"/>
-        </w:rPr>
-        <w:t xml:space="preserve">United Academy</w:t>
+        <w:spacing w:after="0" w:afterAutospacing="0" w:before="240" w:lineRule="auto"/>
+        <w:ind w:left="720" w:hanging="360"/>
+      </w:pPr>
+      <w:r>
+        <w:rPr>
+          <w:rtl w:val="0"/>
+        </w:rPr>
+        <w:t xml:space="preserve">Reports of parents being verbally abused over their children’s comparatively weak academic performance.</w:t>
       </w:r>
     </w:p>
     <w:p>
       <w:pPr>
         <w:numPr>
           <w:ilvl w:val="0"/>
-          <w:numId w:val="9"/>
+          <w:numId w:val="4"/>
         </w:numPr>
-        <w:ind w:left="720" w:hanging="360"/>
-        <w:rPr>
-          <w:u w:val="none"/>
-        </w:rPr>
-      </w:pPr>
-      <w:r>
-        <w:rPr>
-          <w:rtl w:val="0"/>
-        </w:rPr>
-        <w:t xml:space="preserve">Extreme physical punishments for unverified offences</w:t>
+        <w:spacing w:after="240" w:before="0" w:beforeAutospacing="0" w:lineRule="auto"/>
+        <w:ind w:left="720" w:hanging="360"/>
+      </w:pPr>
+      <w:r>
+        <w:rPr>
+          <w:rtl w:val="0"/>
+        </w:rPr>
+        <w:t xml:space="preserve">Reports of severe academic pressure and concerns about its potential effects on student well-being.</w:t>
+      </w:r>
+    </w:p>
+    <w:p>
+      <w:pPr>
+        <w:pStyle w:val="Heading3"/>
+        <w:keepNext w:val="0"/>
+        <w:keepLines w:val="0"/>
+        <w:spacing w:before="280" w:lineRule="auto"/>
+        <w:rPr>
+          <w:b w:val="1"/>
+          <w:bCs w:val="1"/>
+          <w:color w:val="000000"/>
+          <w:sz w:val="26"/>
+          <w:szCs w:val="26"/>
+        </w:rPr>
+      </w:pPr>
+      <w:bookmarkStart w:colFirst="0" w:colLast="0" w:name="_gtmlmkm5ojjx" w:id="7"/>
+      <w:bookmarkEnd w:id="7"/>
+      <w:r>
+        <w:rPr>
+          <w:b w:val="1"/>
+          <w:bCs w:val="1"/>
+          <w:color w:val="000000"/>
+          <w:sz w:val="26"/>
+          <w:szCs w:val="26"/>
+          <w:rtl w:val="0"/>
+        </w:rPr>
+        <w:t xml:space="preserve">VS Niketan</w:t>
       </w:r>
     </w:p>
     <w:p>
       <w:pPr>
         <w:numPr>
           <w:ilvl w:val="0"/>
-          <w:numId w:val="9"/>
+          <w:numId w:val="1"/>
         </w:numPr>
-        <w:ind w:left="720" w:hanging="360"/>
-        <w:rPr>
-          <w:u w:val="none"/>
-        </w:rPr>
-      </w:pPr>
-      <w:r>
-        <w:rPr>
-          <w:rtl w:val="0"/>
-        </w:rPr>
-        <w:t xml:space="preserve">Disciplinary actions taken for school rule infringements outside school premises</w:t>
-      </w:r>
-    </w:p>
-    <w:p>
-      <w:pPr>
-        <w:rPr/>
-      </w:pPr>
-      <w:r>
-        <w:rPr>
-          <w:rtl w:val="0"/>
-        </w:rPr>
-      </w:r>
-    </w:p>
-    <w:p>
-      <w:pPr>
-        <w:rPr/>
-      </w:pPr>
-      <w:r>
-        <w:rPr>
-          <w:rtl w:val="0"/>
-        </w:rPr>
-        <w:t xml:space="preserve">KMC Bagbazar</w:t>
+        <w:spacing w:after="240" w:before="240" w:lineRule="auto"/>
+        <w:ind w:left="720" w:hanging="360"/>
+      </w:pPr>
+      <w:r>
+        <w:rPr>
+          <w:rtl w:val="0"/>
+        </w:rPr>
+        <w:t xml:space="preserve">Reports alleging that a teacher accused of rape was permitted to continue teaching. The circumstances and the school’s response require clarification.</w:t>
+      </w:r>
+    </w:p>
+    <w:p>
+      <w:pPr>
+        <w:pStyle w:val="Heading3"/>
+        <w:keepNext w:val="0"/>
+        <w:keepLines w:val="0"/>
+        <w:spacing w:before="280" w:lineRule="auto"/>
+        <w:rPr>
+          <w:b w:val="1"/>
+          <w:bCs w:val="1"/>
+          <w:color w:val="000000"/>
+          <w:sz w:val="26"/>
+          <w:szCs w:val="26"/>
+        </w:rPr>
+      </w:pPr>
+      <w:bookmarkStart w:colFirst="0" w:colLast="0" w:name="_sa3975juj4af" w:id="8"/>
+      <w:bookmarkEnd w:id="8"/>
+      <w:r>
+        <w:rPr>
+          <w:b w:val="1"/>
+          <w:bCs w:val="1"/>
+          <w:color w:val="000000"/>
+          <w:sz w:val="26"/>
+          <w:szCs w:val="26"/>
+          <w:rtl w:val="0"/>
+        </w:rPr>
+        <w:t xml:space="preserve">Ace Higher Secondary</w:t>
       </w:r>
     </w:p>
     <w:p>
@@ -126,16 +564,14 @@
           <w:ilvl w:val="0"/>
           <w:numId w:val="5"/>
         </w:numPr>
-        <w:ind w:left="720" w:hanging="360"/>
-        <w:rPr>
-          <w:u w:val="none"/>
-        </w:rPr>
-      </w:pPr>
-      <w:r>
-        <w:rPr>
-          <w:rtl w:val="0"/>
-        </w:rPr>
-        <w:t xml:space="preserve">Physical assaults for minor disciplinary violations (Using washrooms during class time)</w:t>
+        <w:spacing w:after="0" w:afterAutospacing="0" w:before="240" w:lineRule="auto"/>
+        <w:ind w:left="720" w:hanging="360"/>
+      </w:pPr>
+      <w:r>
+        <w:rPr>
+          <w:rtl w:val="0"/>
+        </w:rPr>
+        <w:t xml:space="preserve">Concerns regarding potentially misleading advertising and the authenticity of online reviews.</w:t>
       </w:r>
     </w:p>
     <w:p>
@@ -144,417 +580,14 @@
           <w:ilvl w:val="0"/>
           <w:numId w:val="5"/>
         </w:numPr>
-        <w:ind w:left="720" w:hanging="360"/>
-        <w:rPr>
-          <w:u w:val="none"/>
-        </w:rPr>
-      </w:pPr>
-      <w:r>
-        <w:rPr>
-          <w:rtl w:val="0"/>
-        </w:rPr>
-        <w:t xml:space="preserve">Public humiliation; Verbal assaults [called a student a whore publicly]</w:t>
-      </w:r>
-    </w:p>
-    <w:p>
-      <w:pPr>
-        <w:numPr>
-          <w:ilvl w:val="0"/>
-          <w:numId w:val="5"/>
-        </w:numPr>
-        <w:ind w:left="720" w:hanging="360"/>
-        <w:rPr>
-          <w:u w:val="none"/>
-        </w:rPr>
-      </w:pPr>
-      <w:r>
-        <w:rPr>
-          <w:rtl w:val="0"/>
-        </w:rPr>
-        <w:t xml:space="preserve">Sexual assault and sexual coersion by school authorities (especially female students)</w:t>
-      </w:r>
-    </w:p>
-    <w:p>
-      <w:pPr>
-        <w:numPr>
-          <w:ilvl w:val="0"/>
-          <w:numId w:val="5"/>
-        </w:numPr>
-        <w:ind w:left="720" w:hanging="360"/>
-        <w:rPr>
-          <w:u w:val="none"/>
-        </w:rPr>
-      </w:pPr>
-      <w:r>
-        <w:rPr>
-          <w:rtl w:val="0"/>
-        </w:rPr>
-        <w:t xml:space="preserve">Verbally abused students over family issues</w:t>
-      </w:r>
-    </w:p>
-    <w:p>
-      <w:pPr>
-        <w:numPr>
-          <w:ilvl w:val="0"/>
-          <w:numId w:val="5"/>
-        </w:numPr>
-        <w:ind w:left="720" w:hanging="360"/>
-        <w:rPr>
-          <w:u w:val="none"/>
-        </w:rPr>
-      </w:pPr>
-      <w:r>
-        <w:rPr>
-          <w:rtl w:val="0"/>
-        </w:rPr>
-        <w:t xml:space="preserve">Female CI stalking students’ private lives; Accusing students of wearing makeups (completely legal) and punishing them</w:t>
-      </w:r>
-    </w:p>
-    <w:p>
-      <w:pPr>
-        <w:numPr>
-          <w:ilvl w:val="0"/>
-          <w:numId w:val="5"/>
-        </w:numPr>
-        <w:ind w:left="720" w:hanging="360"/>
-        <w:rPr>
-          <w:u w:val="none"/>
-        </w:rPr>
-      </w:pPr>
-      <w:r>
-        <w:rPr>
-          <w:rtl w:val="0"/>
-        </w:rPr>
-        <w:t xml:space="preserve">Teachers (PNC and SPJ) sexually assaulting female students and even sending inappropriate pictures in their DMs (straight up paedophilia)</w:t>
-      </w:r>
-    </w:p>
-    <w:p>
-      <w:pPr>
-        <w:numPr>
-          <w:ilvl w:val="0"/>
-          <w:numId w:val="5"/>
-        </w:numPr>
-        <w:ind w:left="720" w:hanging="360"/>
-        <w:rPr>
-          <w:u w:val="none"/>
-        </w:rPr>
-      </w:pPr>
-      <w:r>
-        <w:rPr>
-          <w:rtl w:val="0"/>
-        </w:rPr>
-        <w:t xml:space="preserve">Discourage curiosity and forcefully make students memorize books</w:t>
-      </w:r>
-    </w:p>
-    <w:p>
-      <w:pPr>
-        <w:rPr/>
-      </w:pPr>
-      <w:r>
-        <w:rPr>
-          <w:rtl w:val="0"/>
-        </w:rPr>
-      </w:r>
-    </w:p>
-    <w:p>
-      <w:pPr>
-        <w:rPr/>
-      </w:pPr>
-      <w:r>
-        <w:rPr>
-          <w:rtl w:val="0"/>
-        </w:rPr>
-        <w:t xml:space="preserve">St. Marys</w:t>
-      </w:r>
-    </w:p>
-    <w:p>
-      <w:pPr>
-        <w:numPr>
-          <w:ilvl w:val="0"/>
-          <w:numId w:val="1"/>
-        </w:numPr>
-        <w:ind w:left="720" w:hanging="360"/>
-        <w:rPr>
-          <w:u w:val="none"/>
-        </w:rPr>
-      </w:pPr>
-      <w:r>
-        <w:rPr>
-          <w:rtl w:val="0"/>
-        </w:rPr>
-        <w:t xml:space="preserve">Extremely conservative dressing standards (This have led to physical abuses)</w:t>
-      </w:r>
-    </w:p>
-    <w:p>
-      <w:pPr>
-        <w:numPr>
-          <w:ilvl w:val="0"/>
-          <w:numId w:val="1"/>
-        </w:numPr>
-        <w:ind w:left="720" w:hanging="360"/>
-        <w:rPr>
-          <w:u w:val="none"/>
-        </w:rPr>
-      </w:pPr>
-      <w:r>
-        <w:rPr>
-          <w:rtl w:val="0"/>
-        </w:rPr>
-        <w:t xml:space="preserve">Privacy and Child Rights Violition</w:t>
-      </w:r>
-    </w:p>
-    <w:p>
-      <w:pPr>
-        <w:numPr>
-          <w:ilvl w:val="0"/>
-          <w:numId w:val="1"/>
-        </w:numPr>
-        <w:ind w:left="720" w:hanging="360"/>
-        <w:rPr>
-          <w:u w:val="none"/>
-        </w:rPr>
-      </w:pPr>
-      <w:r>
-        <w:rPr>
-          <w:rtl w:val="0"/>
-        </w:rPr>
-        <w:t xml:space="preserve">Religious brainwashing of students</w:t>
-      </w:r>
-    </w:p>
-    <w:p>
-      <w:pPr>
-        <w:numPr>
-          <w:ilvl w:val="0"/>
-          <w:numId w:val="1"/>
-        </w:numPr>
-        <w:ind w:left="720" w:hanging="360"/>
-        <w:rPr>
-          <w:u w:val="none"/>
-        </w:rPr>
-      </w:pPr>
-      <w:r>
-        <w:rPr>
-          <w:rtl w:val="0"/>
-        </w:rPr>
-        <w:t xml:space="preserve">Completely prohibited male-female interaction (even outside school premises)</w:t>
-      </w:r>
-    </w:p>
-    <w:p>
-      <w:pPr>
-        <w:ind w:left="0" w:firstLine="0"/>
-        <w:rPr/>
-      </w:pPr>
-      <w:r>
-        <w:rPr>
-          <w:rtl w:val="0"/>
-        </w:rPr>
-        <w:br w:type="textWrapping"/>
-        <w:t xml:space="preserve">GEMS</w:t>
-      </w:r>
-    </w:p>
-    <w:p>
-      <w:pPr>
-        <w:numPr>
-          <w:ilvl w:val="0"/>
-          <w:numId w:val="6"/>
-        </w:numPr>
-        <w:ind w:left="720" w:hanging="360"/>
-        <w:rPr>
-          <w:u w:val="none"/>
-        </w:rPr>
-      </w:pPr>
-      <w:r>
-        <w:rPr>
-          <w:rtl w:val="0"/>
-        </w:rPr>
-        <w:t xml:space="preserve">Physical Bullying by teachers</w:t>
-      </w:r>
-    </w:p>
-    <w:p>
-      <w:pPr>
-        <w:ind w:left="720" w:firstLine="0"/>
-        <w:rPr/>
-      </w:pPr>
-      <w:r>
-        <w:rPr>
-          <w:rtl w:val="0"/>
-        </w:rPr>
-      </w:r>
-    </w:p>
-    <w:p>
-      <w:pPr>
-        <w:rPr/>
-      </w:pPr>
-      <w:r>
-        <w:rPr>
-          <w:rtl w:val="0"/>
-        </w:rPr>
-        <w:t xml:space="preserve">Kavya</w:t>
-      </w:r>
-    </w:p>
-    <w:p>
-      <w:pPr>
-        <w:numPr>
-          <w:ilvl w:val="0"/>
-          <w:numId w:val="3"/>
-        </w:numPr>
-        <w:ind w:left="720" w:hanging="360"/>
-        <w:rPr>
-          <w:u w:val="none"/>
-        </w:rPr>
-      </w:pPr>
-      <w:r>
-        <w:rPr>
-          <w:rtl w:val="0"/>
-        </w:rPr>
-        <w:t xml:space="preserve">School staff physically beating students and making verbal threats</w:t>
-      </w:r>
-    </w:p>
-    <w:p>
-      <w:pPr>
-        <w:rPr/>
-      </w:pPr>
-      <w:r>
-        <w:rPr>
-          <w:rtl w:val="0"/>
-        </w:rPr>
-      </w:r>
-    </w:p>
-    <w:p>
-      <w:pPr>
-        <w:rPr/>
-      </w:pPr>
-      <w:r>
-        <w:rPr>
-          <w:rtl w:val="0"/>
-        </w:rPr>
-        <w:t xml:space="preserve">DAV</w:t>
-      </w:r>
-    </w:p>
-    <w:p>
-      <w:pPr>
-        <w:numPr>
-          <w:ilvl w:val="0"/>
-          <w:numId w:val="2"/>
-        </w:numPr>
-        <w:ind w:left="720" w:hanging="360"/>
-        <w:rPr>
-          <w:u w:val="none"/>
-        </w:rPr>
-      </w:pPr>
-      <w:r>
-        <w:rPr>
-          <w:rtl w:val="0"/>
-        </w:rPr>
-        <w:t xml:space="preserve">Verbally abusing parents for children for their relatively weak academic performance</w:t>
-      </w:r>
-    </w:p>
-    <w:p>
-      <w:pPr>
-        <w:numPr>
-          <w:ilvl w:val="0"/>
-          <w:numId w:val="2"/>
-        </w:numPr>
-        <w:ind w:left="720" w:hanging="360"/>
-        <w:rPr>
-          <w:u w:val="none"/>
-        </w:rPr>
-      </w:pPr>
-      <w:r>
-        <w:rPr>
-          <w:rtl w:val="0"/>
-        </w:rPr>
-        <w:t xml:space="preserve">Extreme academic pressures which might’ve led to suicides</w:t>
-      </w:r>
-    </w:p>
-    <w:p>
-      <w:pPr>
-        <w:ind w:left="0" w:firstLine="0"/>
-        <w:rPr/>
-      </w:pPr>
-      <w:r>
-        <w:rPr>
-          <w:rtl w:val="0"/>
-        </w:rPr>
-      </w:r>
-    </w:p>
-    <w:p>
-      <w:pPr>
-        <w:ind w:left="0" w:firstLine="0"/>
-        <w:rPr/>
-      </w:pPr>
-      <w:r>
-        <w:rPr>
-          <w:rtl w:val="0"/>
-        </w:rPr>
-        <w:t xml:space="preserve">VS Niketan</w:t>
-      </w:r>
-    </w:p>
-    <w:p>
-      <w:pPr>
-        <w:numPr>
-          <w:ilvl w:val="0"/>
-          <w:numId w:val="8"/>
-        </w:numPr>
-        <w:ind w:left="720" w:hanging="360"/>
-        <w:rPr>
-          <w:u w:val="none"/>
-        </w:rPr>
-      </w:pPr>
-      <w:r>
-        <w:rPr>
-          <w:rtl w:val="0"/>
-        </w:rPr>
-        <w:t xml:space="preserve">Allegedly letting a rapist teacher continue teaching</w:t>
-      </w:r>
-    </w:p>
-    <w:p>
-      <w:pPr>
-        <w:ind w:left="0" w:firstLine="0"/>
-        <w:rPr/>
-      </w:pPr>
-      <w:r>
-        <w:rPr>
-          <w:rtl w:val="0"/>
-        </w:rPr>
-        <w:br w:type="textWrapping"/>
-        <w:t xml:space="preserve">Ace Higher Secondary</w:t>
-      </w:r>
-    </w:p>
-    <w:p>
-      <w:pPr>
-        <w:numPr>
-          <w:ilvl w:val="0"/>
-          <w:numId w:val="7"/>
-        </w:numPr>
-        <w:ind w:left="720" w:hanging="360"/>
-        <w:rPr>
-          <w:u w:val="none"/>
-        </w:rPr>
-      </w:pPr>
-      <w:r>
-        <w:rPr>
-          <w:rtl w:val="0"/>
-        </w:rPr>
-        <w:t xml:space="preserve">False Advertising and fabricating online reviews </w:t>
-      </w:r>
-    </w:p>
-    <w:p>
-      <w:pPr>
-        <w:numPr>
-          <w:ilvl w:val="0"/>
-          <w:numId w:val="7"/>
-        </w:numPr>
-        <w:ind w:left="720" w:hanging="360"/>
-        <w:rPr>
-          <w:u w:val="none"/>
-        </w:rPr>
-      </w:pPr>
-      <w:r>
-        <w:rPr>
-          <w:rtl w:val="0"/>
-        </w:rPr>
-        <w:t xml:space="preserve">Forcing students to give the school 5 star reviews online</w:t>
+        <w:spacing w:after="240" w:before="0" w:beforeAutospacing="0" w:lineRule="auto"/>
+        <w:ind w:left="720" w:hanging="360"/>
+      </w:pPr>
+      <w:r>
+        <w:rPr>
+          <w:rtl w:val="0"/>
+        </w:rPr>
+        <w:t xml:space="preserve">Reports that students were pressured or required to post five-star reviews of the school online.</w:t>
       </w:r>
     </w:p>
     <w:p>
@@ -591,8 +624,8 @@
   <w:abstractNum w:abstractNumId="1">
     <w:lvl w:ilvl="0">
       <w:start w:val="1"/>
-      <w:numFmt w:val="decimal"/>
-      <w:lvlText w:val="%1."/>
+      <w:numFmt w:val="bullet"/>
+      <w:lvlText w:val="●"/>
       <w:lvlJc w:val="left"/>
       <w:pPr>
         <w:ind w:left="720" w:hanging="360"/>
@@ -603,8 +636,8 @@
     </w:lvl>
     <w:lvl w:ilvl="1">
       <w:start w:val="1"/>
-      <w:numFmt w:val="lowerLetter"/>
-      <w:lvlText w:val="%2."/>
+      <w:numFmt w:val="bullet"/>
+      <w:lvlText w:val="○"/>
       <w:lvlJc w:val="left"/>
       <w:pPr>
         <w:ind w:left="1440" w:hanging="360"/>
@@ -615,9 +648,9 @@
     </w:lvl>
     <w:lvl w:ilvl="2">
       <w:start w:val="1"/>
-      <w:numFmt w:val="lowerRoman"/>
-      <w:lvlText w:val="%3."/>
-      <w:lvlJc w:val="right"/>
+      <w:numFmt w:val="bullet"/>
+      <w:lvlText w:val="■"/>
+      <w:lvlJc w:val="left"/>
       <w:pPr>
         <w:ind w:left="2160" w:hanging="360"/>
       </w:pPr>
@@ -627,8 +660,8 @@
     </w:lvl>
     <w:lvl w:ilvl="3">
       <w:start w:val="1"/>
-      <w:numFmt w:val="decimal"/>
-      <w:lvlText w:val="%4."/>
+      <w:numFmt w:val="bullet"/>
+      <w:lvlText w:val="●"/>
       <w:lvlJc w:val="left"/>
       <w:pPr>
         <w:ind w:left="2880" w:hanging="360"/>
@@ -639,8 +672,8 @@
     </w:lvl>
     <w:lvl w:ilvl="4">
       <w:start w:val="1"/>
-      <w:numFmt w:val="lowerLetter"/>
-      <w:lvlText w:val="%5."/>
+      <w:numFmt w:val="bullet"/>
+      <w:lvlText w:val="○"/>
       <w:lvlJc w:val="left"/>
       <w:pPr>
         <w:ind w:left="3600" w:hanging="360"/>
@@ -651,9 +684,9 @@
     </w:lvl>
     <w:lvl w:ilvl="5">
       <w:start w:val="1"/>
-      <w:numFmt w:val="lowerRoman"/>
-      <w:lvlText w:val="%6."/>
-      <w:lvlJc w:val="right"/>
+      <w:numFmt w:val="bullet"/>
+      <w:lvlText w:val="■"/>
+      <w:lvlJc w:val="left"/>
       <w:pPr>
         <w:ind w:left="4320" w:hanging="360"/>
       </w:pPr>
@@ -663,8 +696,8 @@
     </w:lvl>
     <w:lvl w:ilvl="6">
       <w:start w:val="1"/>
-      <w:numFmt w:val="decimal"/>
-      <w:lvlText w:val="%7."/>
+      <w:numFmt w:val="bullet"/>
+      <w:lvlText w:val="●"/>
       <w:lvlJc w:val="left"/>
       <w:pPr>
         <w:ind w:left="5040" w:hanging="360"/>
@@ -675,8 +708,8 @@
     </w:lvl>
     <w:lvl w:ilvl="7">
       <w:start w:val="1"/>
-      <w:numFmt w:val="lowerLetter"/>
-      <w:lvlText w:val="%8."/>
+      <w:numFmt w:val="bullet"/>
+      <w:lvlText w:val="○"/>
       <w:lvlJc w:val="left"/>
       <w:pPr>
         <w:ind w:left="5760" w:hanging="360"/>
@@ -687,9 +720,9 @@
     </w:lvl>
     <w:lvl w:ilvl="8">
       <w:start w:val="1"/>
-      <w:numFmt w:val="lowerRoman"/>
-      <w:lvlText w:val="%9."/>
-      <w:lvlJc w:val="right"/>
+      <w:numFmt w:val="bullet"/>
+      <w:lvlText w:val="■"/>
+      <w:lvlJc w:val="left"/>
       <w:pPr>
         <w:ind w:left="6480" w:hanging="360"/>
       </w:pPr>
@@ -701,8 +734,8 @@
   <w:abstractNum w:abstractNumId="2">
     <w:lvl w:ilvl="0">
       <w:start w:val="1"/>
-      <w:numFmt w:val="decimal"/>
-      <w:lvlText w:val="%1."/>
+      <w:numFmt w:val="bullet"/>
+      <w:lvlText w:val="●"/>
       <w:lvlJc w:val="left"/>
       <w:pPr>
         <w:ind w:left="720" w:hanging="360"/>
@@ -713,8 +746,8 @@
     </w:lvl>
     <w:lvl w:ilvl="1">
       <w:start w:val="1"/>
-      <w:numFmt w:val="lowerLetter"/>
-      <w:lvlText w:val="%2."/>
+      <w:numFmt w:val="bullet"/>
+      <w:lvlText w:val="○"/>
       <w:lvlJc w:val="left"/>
       <w:pPr>
         <w:ind w:left="1440" w:hanging="360"/>
@@ -725,9 +758,9 @@
     </w:lvl>
     <w:lvl w:ilvl="2">
       <w:start w:val="1"/>
-      <w:numFmt w:val="lowerRoman"/>
-      <w:lvlText w:val="%3."/>
-      <w:lvlJc w:val="right"/>
+      <w:numFmt w:val="bullet"/>
+      <w:lvlText w:val="■"/>
+      <w:lvlJc w:val="left"/>
       <w:pPr>
         <w:ind w:left="2160" w:hanging="360"/>
       </w:pPr>
@@ -737,8 +770,8 @@
     </w:lvl>
     <w:lvl w:ilvl="3">
       <w:start w:val="1"/>
-      <w:numFmt w:val="decimal"/>
-      <w:lvlText w:val="%4."/>
+      <w:numFmt w:val="bullet"/>
+      <w:lvlText w:val="●"/>
       <w:lvlJc w:val="left"/>
       <w:pPr>
         <w:ind w:left="2880" w:hanging="360"/>
@@ -749,8 +782,8 @@
     </w:lvl>
     <w:lvl w:ilvl="4">
       <w:start w:val="1"/>
-      <w:numFmt w:val="lowerLetter"/>
-      <w:lvlText w:val="%5."/>
+      <w:numFmt w:val="bullet"/>
+      <w:lvlText w:val="○"/>
       <w:lvlJc w:val="left"/>
       <w:pPr>
         <w:ind w:left="3600" w:hanging="360"/>
@@ -761,9 +794,9 @@
     </w:lvl>
     <w:lvl w:ilvl="5">
       <w:start w:val="1"/>
-      <w:numFmt w:val="lowerRoman"/>
-      <w:lvlText w:val="%6."/>
-      <w:lvlJc w:val="right"/>
+      <w:numFmt w:val="bullet"/>
+      <w:lvlText w:val="■"/>
+      <w:lvlJc w:val="left"/>
       <w:pPr>
         <w:ind w:left="4320" w:hanging="360"/>
       </w:pPr>
@@ -773,8 +806,8 @@
     </w:lvl>
     <w:lvl w:ilvl="6">
       <w:start w:val="1"/>
-      <w:numFmt w:val="decimal"/>
-      <w:lvlText w:val="%7."/>
+      <w:numFmt w:val="bullet"/>
+      <w:lvlText w:val="●"/>
       <w:lvlJc w:val="left"/>
       <w:pPr>
         <w:ind w:left="5040" w:hanging="360"/>
@@ -785,8 +818,8 @@
     </w:lvl>
     <w:lvl w:ilvl="7">
       <w:start w:val="1"/>
-      <w:numFmt w:val="lowerLetter"/>
-      <w:lvlText w:val="%8."/>
+      <w:numFmt w:val="bullet"/>
+      <w:lvlText w:val="○"/>
       <w:lvlJc w:val="left"/>
       <w:pPr>
         <w:ind w:left="5760" w:hanging="360"/>
@@ -797,9 +830,9 @@
     </w:lvl>
     <w:lvl w:ilvl="8">
       <w:start w:val="1"/>
-      <w:numFmt w:val="lowerRoman"/>
-      <w:lvlText w:val="%9."/>
-      <w:lvlJc w:val="right"/>
+      <w:numFmt w:val="bullet"/>
+      <w:lvlText w:val="■"/>
+      <w:lvlJc w:val="left"/>
       <w:pPr>
         <w:ind w:left="6480" w:hanging="360"/>
       </w:pPr>
@@ -811,8 +844,8 @@
   <w:abstractNum w:abstractNumId="3">
     <w:lvl w:ilvl="0">
       <w:start w:val="1"/>
-      <w:numFmt w:val="decimal"/>
-      <w:lvlText w:val="%1."/>
+      <w:numFmt w:val="bullet"/>
+      <w:lvlText w:val="●"/>
       <w:lvlJc w:val="left"/>
       <w:pPr>
         <w:ind w:left="720" w:hanging="360"/>
@@ -823,8 +856,8 @@
     </w:lvl>
     <w:lvl w:ilvl="1">
       <w:start w:val="1"/>
-      <w:numFmt w:val="lowerLetter"/>
-      <w:lvlText w:val="%2."/>
+      <w:numFmt w:val="bullet"/>
+      <w:lvlText w:val="○"/>
       <w:lvlJc w:val="left"/>
       <w:pPr>
         <w:ind w:left="1440" w:hanging="360"/>
@@ -835,9 +868,9 @@
     </w:lvl>
     <w:lvl w:ilvl="2">
       <w:start w:val="1"/>
-      <w:numFmt w:val="lowerRoman"/>
-      <w:lvlText w:val="%3."/>
-      <w:lvlJc w:val="right"/>
+      <w:numFmt w:val="bullet"/>
+      <w:lvlText w:val="■"/>
+      <w:lvlJc w:val="left"/>
       <w:pPr>
         <w:ind w:left="2160" w:hanging="360"/>
       </w:pPr>
@@ -847,8 +880,8 @@
     </w:lvl>
     <w:lvl w:ilvl="3">
       <w:start w:val="1"/>
-      <w:numFmt w:val="decimal"/>
-      <w:lvlText w:val="%4."/>
+      <w:numFmt w:val="bullet"/>
+      <w:lvlText w:val="●"/>
       <w:lvlJc w:val="left"/>
       <w:pPr>
         <w:ind w:left="2880" w:hanging="360"/>
@@ -859,8 +892,8 @@
     </w:lvl>
     <w:lvl w:ilvl="4">
       <w:start w:val="1"/>
-      <w:numFmt w:val="lowerLetter"/>
-      <w:lvlText w:val="%5."/>
+      <w:numFmt w:val="bullet"/>
+      <w:lvlText w:val="○"/>
       <w:lvlJc w:val="left"/>
       <w:pPr>
         <w:ind w:left="3600" w:hanging="360"/>
@@ -871,9 +904,9 @@
     </w:lvl>
     <w:lvl w:ilvl="5">
       <w:start w:val="1"/>
-      <w:numFmt w:val="lowerRoman"/>
-      <w:lvlText w:val="%6."/>
-      <w:lvlJc w:val="right"/>
+      <w:numFmt w:val="bullet"/>
+      <w:lvlText w:val="■"/>
+      <w:lvlJc w:val="left"/>
       <w:pPr>
         <w:ind w:left="4320" w:hanging="360"/>
       </w:pPr>
@@ -883,8 +916,8 @@
     </w:lvl>
     <w:lvl w:ilvl="6">
       <w:start w:val="1"/>
-      <w:numFmt w:val="decimal"/>
-      <w:lvlText w:val="%7."/>
+      <w:numFmt w:val="bullet"/>
+      <w:lvlText w:val="●"/>
       <w:lvlJc w:val="left"/>
       <w:pPr>
         <w:ind w:left="5040" w:hanging="360"/>
@@ -895,8 +928,8 @@
     </w:lvl>
     <w:lvl w:ilvl="7">
       <w:start w:val="1"/>
-      <w:numFmt w:val="lowerLetter"/>
-      <w:lvlText w:val="%8."/>
+      <w:numFmt w:val="bullet"/>
+      <w:lvlText w:val="○"/>
       <w:lvlJc w:val="left"/>
       <w:pPr>
         <w:ind w:left="5760" w:hanging="360"/>
@@ -907,9 +940,9 @@
     </w:lvl>
     <w:lvl w:ilvl="8">
       <w:start w:val="1"/>
-      <w:numFmt w:val="lowerRoman"/>
-      <w:lvlText w:val="%9."/>
-      <w:lvlJc w:val="right"/>
+      <w:numFmt w:val="bullet"/>
+      <w:lvlText w:val="■"/>
+      <w:lvlJc w:val="left"/>
       <w:pPr>
         <w:ind w:left="6480" w:hanging="360"/>
       </w:pPr>
@@ -921,8 +954,8 @@
   <w:abstractNum w:abstractNumId="4">
     <w:lvl w:ilvl="0">
       <w:start w:val="1"/>
-      <w:numFmt w:val="decimal"/>
-      <w:lvlText w:val="%1."/>
+      <w:numFmt w:val="bullet"/>
+      <w:lvlText w:val="●"/>
       <w:lvlJc w:val="left"/>
       <w:pPr>
         <w:ind w:left="720" w:hanging="360"/>
@@ -933,8 +966,8 @@
     </w:lvl>
     <w:lvl w:ilvl="1">
       <w:start w:val="1"/>
-      <w:numFmt w:val="lowerLetter"/>
-      <w:lvlText w:val="%2."/>
+      <w:numFmt w:val="bullet"/>
+      <w:lvlText w:val="○"/>
       <w:lvlJc w:val="left"/>
       <w:pPr>
         <w:ind w:left="1440" w:hanging="360"/>
@@ -945,9 +978,9 @@
     </w:lvl>
     <w:lvl w:ilvl="2">
       <w:start w:val="1"/>
-      <w:numFmt w:val="lowerRoman"/>
-      <w:lvlText w:val="%3."/>
-      <w:lvlJc w:val="right"/>
+      <w:numFmt w:val="bullet"/>
+      <w:lvlText w:val="■"/>
+      <w:lvlJc w:val="left"/>
       <w:pPr>
         <w:ind w:left="2160" w:hanging="360"/>
       </w:pPr>
@@ -957,8 +990,8 @@
     </w:lvl>
     <w:lvl w:ilvl="3">
       <w:start w:val="1"/>
-      <w:numFmt w:val="decimal"/>
-      <w:lvlText w:val="%4."/>
+      <w:numFmt w:val="bullet"/>
+      <w:lvlText w:val="●"/>
       <w:lvlJc w:val="left"/>
       <w:pPr>
         <w:ind w:left="2880" w:hanging="360"/>
@@ -969,8 +1002,8 @@
     </w:lvl>
     <w:lvl w:ilvl="4">
       <w:start w:val="1"/>
-      <w:numFmt w:val="lowerLetter"/>
-      <w:lvlText w:val="%5."/>
+      <w:numFmt w:val="bullet"/>
+      <w:lvlText w:val="○"/>
       <w:lvlJc w:val="left"/>
       <w:pPr>
         <w:ind w:left="3600" w:hanging="360"/>
@@ -981,9 +1014,9 @@
     </w:lvl>
     <w:lvl w:ilvl="5">
       <w:start w:val="1"/>
-      <w:numFmt w:val="lowerRoman"/>
-      <w:lvlText w:val="%6."/>
-      <w:lvlJc w:val="right"/>
+      <w:numFmt w:val="bullet"/>
+      <w:lvlText w:val="■"/>
+      <w:lvlJc w:val="left"/>
       <w:pPr>
         <w:ind w:left="4320" w:hanging="360"/>
       </w:pPr>
@@ -993,8 +1026,8 @@
     </w:lvl>
     <w:lvl w:ilvl="6">
       <w:start w:val="1"/>
-      <w:numFmt w:val="decimal"/>
-      <w:lvlText w:val="%7."/>
+      <w:numFmt w:val="bullet"/>
+      <w:lvlText w:val="●"/>
       <w:lvlJc w:val="left"/>
       <w:pPr>
         <w:ind w:left="5040" w:hanging="360"/>
@@ -1005,8 +1038,8 @@
     </w:lvl>
     <w:lvl w:ilvl="7">
       <w:start w:val="1"/>
-      <w:numFmt w:val="lowerLetter"/>
-      <w:lvlText w:val="%8."/>
+      <w:numFmt w:val="bullet"/>
+      <w:lvlText w:val="○"/>
       <w:lvlJc w:val="left"/>
       <w:pPr>
         <w:ind w:left="5760" w:hanging="360"/>
@@ -1017,9 +1050,9 @@
     </w:lvl>
     <w:lvl w:ilvl="8">
       <w:start w:val="1"/>
-      <w:numFmt w:val="lowerRoman"/>
-      <w:lvlText w:val="%9."/>
-      <w:lvlJc w:val="right"/>
+      <w:numFmt w:val="bullet"/>
+      <w:lvlText w:val="■"/>
+      <w:lvlJc w:val="left"/>
       <w:pPr>
         <w:ind w:left="6480" w:hanging="360"/>
       </w:pPr>
@@ -1031,8 +1064,8 @@
   <w:abstractNum w:abstractNumId="5">
     <w:lvl w:ilvl="0">
       <w:start w:val="1"/>
-      <w:numFmt w:val="decimal"/>
-      <w:lvlText w:val="%1."/>
+      <w:numFmt w:val="bullet"/>
+      <w:lvlText w:val="●"/>
       <w:lvlJc w:val="left"/>
       <w:pPr>
         <w:ind w:left="720" w:hanging="360"/>
@@ -1043,8 +1076,8 @@
     </w:lvl>
     <w:lvl w:ilvl="1">
       <w:start w:val="1"/>
-      <w:numFmt w:val="lowerLetter"/>
-      <w:lvlText w:val="%2."/>
+      <w:numFmt w:val="bullet"/>
+      <w:lvlText w:val="○"/>
       <w:lvlJc w:val="left"/>
       <w:pPr>
         <w:ind w:left="1440" w:hanging="360"/>
@@ -1055,9 +1088,9 @@
     </w:lvl>
     <w:lvl w:ilvl="2">
       <w:start w:val="1"/>
-      <w:numFmt w:val="lowerRoman"/>
-      <w:lvlText w:val="%3."/>
-      <w:lvlJc w:val="right"/>
+      <w:numFmt w:val="bullet"/>
+      <w:lvlText w:val="■"/>
+      <w:lvlJc w:val="left"/>
       <w:pPr>
         <w:ind w:left="2160" w:hanging="360"/>
       </w:pPr>
@@ -1067,8 +1100,8 @@
     </w:lvl>
     <w:lvl w:ilvl="3">
       <w:start w:val="1"/>
-      <w:numFmt w:val="decimal"/>
-      <w:lvlText w:val="%4."/>
+      <w:numFmt w:val="bullet"/>
+      <w:lvlText w:val="●"/>
       <w:lvlJc w:val="left"/>
       <w:pPr>
         <w:ind w:left="2880" w:hanging="360"/>
@@ -1079,8 +1112,8 @@
     </w:lvl>
     <w:lvl w:ilvl="4">
       <w:start w:val="1"/>
-      <w:numFmt w:val="lowerLetter"/>
-      <w:lvlText w:val="%5."/>
+      <w:numFmt w:val="bullet"/>
+      <w:lvlText w:val="○"/>
       <w:lvlJc w:val="left"/>
       <w:pPr>
         <w:ind w:left="3600" w:hanging="360"/>
@@ -1091,9 +1124,9 @@
     </w:lvl>
     <w:lvl w:ilvl="5">
       <w:start w:val="1"/>
-      <w:numFmt w:val="lowerRoman"/>
-      <w:lvlText w:val="%6."/>
-      <w:lvlJc w:val="right"/>
+      <w:numFmt w:val="bullet"/>
+      <w:lvlText w:val="■"/>
+      <w:lvlJc w:val="left"/>
       <w:pPr>
         <w:ind w:left="4320" w:hanging="360"/>
       </w:pPr>
@@ -1103,8 +1136,8 @@
     </w:lvl>
     <w:lvl w:ilvl="6">
       <w:start w:val="1"/>
-      <w:numFmt w:val="decimal"/>
-      <w:lvlText w:val="%7."/>
+      <w:numFmt w:val="bullet"/>
+      <w:lvlText w:val="●"/>
       <w:lvlJc w:val="left"/>
       <w:pPr>
         <w:ind w:left="5040" w:hanging="360"/>
@@ -1115,8 +1148,8 @@
     </w:lvl>
     <w:lvl w:ilvl="7">
       <w:start w:val="1"/>
-      <w:numFmt w:val="lowerLetter"/>
-      <w:lvlText w:val="%8."/>
+      <w:numFmt w:val="bullet"/>
+      <w:lvlText w:val="○"/>
       <w:lvlJc w:val="left"/>
       <w:pPr>
         <w:ind w:left="5760" w:hanging="360"/>
@@ -1127,9 +1160,9 @@
     </w:lvl>
     <w:lvl w:ilvl="8">
       <w:start w:val="1"/>
-      <w:numFmt w:val="lowerRoman"/>
-      <w:lvlText w:val="%9."/>
-      <w:lvlJc w:val="right"/>
+      <w:numFmt w:val="bullet"/>
+      <w:lvlText w:val="■"/>
+      <w:lvlJc w:val="left"/>
       <w:pPr>
         <w:ind w:left="6480" w:hanging="360"/>
       </w:pPr>
@@ -1141,8 +1174,8 @@
   <w:abstractNum w:abstractNumId="6">
     <w:lvl w:ilvl="0">
       <w:start w:val="1"/>
-      <w:numFmt w:val="decimal"/>
-      <w:lvlText w:val="%1."/>
+      <w:numFmt w:val="bullet"/>
+      <w:lvlText w:val="●"/>
       <w:lvlJc w:val="left"/>
       <w:pPr>
         <w:ind w:left="720" w:hanging="360"/>
@@ -1153,8 +1186,8 @@
     </w:lvl>
     <w:lvl w:ilvl="1">
       <w:start w:val="1"/>
-      <w:numFmt w:val="lowerLetter"/>
-      <w:lvlText w:val="%2."/>
+      <w:numFmt w:val="bullet"/>
+      <w:lvlText w:val="○"/>
       <w:lvlJc w:val="left"/>
       <w:pPr>
         <w:ind w:left="1440" w:hanging="360"/>
@@ -1165,9 +1198,9 @@
     </w:lvl>
     <w:lvl w:ilvl="2">
       <w:start w:val="1"/>
-      <w:numFmt w:val="lowerRoman"/>
-      <w:lvlText w:val="%3."/>
-      <w:lvlJc w:val="right"/>
+      <w:numFmt w:val="bullet"/>
+      <w:lvlText w:val="■"/>
+      <w:lvlJc w:val="left"/>
       <w:pPr>
         <w:ind w:left="2160" w:hanging="360"/>
       </w:pPr>
@@ -1177,8 +1210,8 @@
     </w:lvl>
     <w:lvl w:ilvl="3">
       <w:start w:val="1"/>
-      <w:numFmt w:val="decimal"/>
-      <w:lvlText w:val="%4."/>
+      <w:numFmt w:val="bullet"/>
+      <w:lvlText w:val="●"/>
       <w:lvlJc w:val="left"/>
       <w:pPr>
         <w:ind w:left="2880" w:hanging="360"/>
@@ -1189,8 +1222,8 @@
     </w:lvl>
     <w:lvl w:ilvl="4">
       <w:start w:val="1"/>
-      <w:numFmt w:val="lowerLetter"/>
-      <w:lvlText w:val="%5."/>
+      <w:numFmt w:val="bullet"/>
+      <w:lvlText w:val="○"/>
       <w:lvlJc w:val="left"/>
       <w:pPr>
         <w:ind w:left="3600" w:hanging="360"/>
@@ -1201,9 +1234,9 @@
     </w:lvl>
     <w:lvl w:ilvl="5">
       <w:start w:val="1"/>
-      <w:numFmt w:val="lowerRoman"/>
-      <w:lvlText w:val="%6."/>
-      <w:lvlJc w:val="right"/>
+      <w:numFmt w:val="bullet"/>
+      <w:lvlText w:val="■"/>
+      <w:lvlJc w:val="left"/>
       <w:pPr>
         <w:ind w:left="4320" w:hanging="360"/>
       </w:pPr>
@@ -1213,8 +1246,8 @@
     </w:lvl>
     <w:lvl w:ilvl="6">
       <w:start w:val="1"/>
-      <w:numFmt w:val="decimal"/>
-      <w:lvlText w:val="%7."/>
+      <w:numFmt w:val="bullet"/>
+      <w:lvlText w:val="●"/>
       <w:lvlJc w:val="left"/>
       <w:pPr>
         <w:ind w:left="5040" w:hanging="360"/>
@@ -1225,8 +1258,8 @@
     </w:lvl>
     <w:lvl w:ilvl="7">
       <w:start w:val="1"/>
-      <w:numFmt w:val="lowerLetter"/>
-      <w:lvlText w:val="%8."/>
+      <w:numFmt w:val="bullet"/>
+      <w:lvlText w:val="○"/>
       <w:lvlJc w:val="left"/>
       <w:pPr>
         <w:ind w:left="5760" w:hanging="360"/>
@@ -1237,9 +1270,9 @@
     </w:lvl>
     <w:lvl w:ilvl="8">
       <w:start w:val="1"/>
-      <w:numFmt w:val="lowerRoman"/>
-      <w:lvlText w:val="%9."/>
-      <w:lvlJc w:val="right"/>
+      <w:numFmt w:val="bullet"/>
+      <w:lvlText w:val="■"/>
+      <w:lvlJc w:val="left"/>
       <w:pPr>
         <w:ind w:left="6480" w:hanging="360"/>
       </w:pPr>
@@ -1251,8 +1284,8 @@
   <w:abstractNum w:abstractNumId="7">
     <w:lvl w:ilvl="0">
       <w:start w:val="1"/>
-      <w:numFmt w:val="decimal"/>
-      <w:lvlText w:val="%1."/>
+      <w:numFmt w:val="bullet"/>
+      <w:lvlText w:val="●"/>
       <w:lvlJc w:val="left"/>
       <w:pPr>
         <w:ind w:left="720" w:hanging="360"/>
@@ -1263,8 +1296,8 @@
     </w:lvl>
     <w:lvl w:ilvl="1">
       <w:start w:val="1"/>
-      <w:numFmt w:val="lowerLetter"/>
-      <w:lvlText w:val="%2."/>
+      <w:numFmt w:val="bullet"/>
+      <w:lvlText w:val="○"/>
       <w:lvlJc w:val="left"/>
       <w:pPr>
         <w:ind w:left="1440" w:hanging="360"/>
@@ -1275,9 +1308,9 @@
     </w:lvl>
     <w:lvl w:ilvl="2">
       <w:start w:val="1"/>
-      <w:numFmt w:val="lowerRoman"/>
-      <w:lvlText w:val="%3."/>
-      <w:lvlJc w:val="right"/>
+      <w:numFmt w:val="bullet"/>
+      <w:lvlText w:val="■"/>
+      <w:lvlJc w:val="left"/>
       <w:pPr>
         <w:ind w:left="2160" w:hanging="360"/>
       </w:pPr>
@@ -1287,8 +1320,8 @@
     </w:lvl>
     <w:lvl w:ilvl="3">
       <w:start w:val="1"/>
-      <w:numFmt w:val="decimal"/>
-      <w:lvlText w:val="%4."/>
+      <w:numFmt w:val="bullet"/>
+      <w:lvlText w:val="●"/>
       <w:lvlJc w:val="left"/>
       <w:pPr>
         <w:ind w:left="2880" w:hanging="360"/>
@@ -1299,8 +1332,8 @@
     </w:lvl>
     <w:lvl w:ilvl="4">
       <w:start w:val="1"/>
-      <w:numFmt w:val="lowerLetter"/>
-      <w:lvlText w:val="%5."/>
+      <w:numFmt w:val="bullet"/>
+      <w:lvlText w:val="○"/>
       <w:lvlJc w:val="left"/>
       <w:pPr>
         <w:ind w:left="3600" w:hanging="360"/>
@@ -1311,9 +1344,9 @@
     </w:lvl>
     <w:lvl w:ilvl="5">
       <w:start w:val="1"/>
-      <w:numFmt w:val="lowerRoman"/>
-      <w:lvlText w:val="%6."/>
-      <w:lvlJc w:val="right"/>
+      <w:numFmt w:val="bullet"/>
+      <w:lvlText w:val="■"/>
+      <w:lvlJc w:val="left"/>
       <w:pPr>
         <w:ind w:left="4320" w:hanging="360"/>
       </w:pPr>
@@ -1323,8 +1356,8 @@
     </w:lvl>
     <w:lvl w:ilvl="6">
       <w:start w:val="1"/>
-      <w:numFmt w:val="decimal"/>
-      <w:lvlText w:val="%7."/>
+      <w:numFmt w:val="bullet"/>
+      <w:lvlText w:val="●"/>
       <w:lvlJc w:val="left"/>
       <w:pPr>
         <w:ind w:left="5040" w:hanging="360"/>
@@ -1335,8 +1368,8 @@
     </w:lvl>
     <w:lvl w:ilvl="7">
       <w:start w:val="1"/>
-      <w:numFmt w:val="lowerLetter"/>
-      <w:lvlText w:val="%8."/>
+      <w:numFmt w:val="bullet"/>
+      <w:lvlText w:val="○"/>
       <w:lvlJc w:val="left"/>
       <w:pPr>
         <w:ind w:left="5760" w:hanging="360"/>
@@ -1347,9 +1380,9 @@
     </w:lvl>
     <w:lvl w:ilvl="8">
       <w:start w:val="1"/>
-      <w:numFmt w:val="lowerRoman"/>
-      <w:lvlText w:val="%9."/>
-      <w:lvlJc w:val="right"/>
+      <w:numFmt w:val="bullet"/>
+      <w:lvlText w:val="■"/>
+      <w:lvlJc w:val="left"/>
       <w:pPr>
         <w:ind w:left="6480" w:hanging="360"/>
       </w:pPr>
@@ -1361,8 +1394,8 @@
   <w:abstractNum w:abstractNumId="8">
     <w:lvl w:ilvl="0">
       <w:start w:val="1"/>
-      <w:numFmt w:val="decimal"/>
-      <w:lvlText w:val="%1."/>
+      <w:numFmt w:val="bullet"/>
+      <w:lvlText w:val="●"/>
       <w:lvlJc w:val="left"/>
       <w:pPr>
         <w:ind w:left="720" w:hanging="360"/>
@@ -1373,8 +1406,8 @@
     </w:lvl>
     <w:lvl w:ilvl="1">
       <w:start w:val="1"/>
-      <w:numFmt w:val="lowerLetter"/>
-      <w:lvlText w:val="%2."/>
+      <w:numFmt w:val="bullet"/>
+      <w:lvlText w:val="○"/>
       <w:lvlJc w:val="left"/>
       <w:pPr>
         <w:ind w:left="1440" w:hanging="360"/>
@@ -1385,9 +1418,9 @@
     </w:lvl>
     <w:lvl w:ilvl="2">
       <w:start w:val="1"/>
-      <w:numFmt w:val="lowerRoman"/>
-      <w:lvlText w:val="%3."/>
-      <w:lvlJc w:val="right"/>
+      <w:numFmt w:val="bullet"/>
+      <w:lvlText w:val="■"/>
+      <w:lvlJc w:val="left"/>
       <w:pPr>
         <w:ind w:left="2160" w:hanging="360"/>
       </w:pPr>
@@ -1397,8 +1430,8 @@
     </w:lvl>
     <w:lvl w:ilvl="3">
       <w:start w:val="1"/>
-      <w:numFmt w:val="decimal"/>
-      <w:lvlText w:val="%4."/>
+      <w:numFmt w:val="bullet"/>
+      <w:lvlText w:val="●"/>
       <w:lvlJc w:val="left"/>
       <w:pPr>
         <w:ind w:left="2880" w:hanging="360"/>
@@ -1409,8 +1442,8 @@
     </w:lvl>
     <w:lvl w:ilvl="4">
       <w:start w:val="1"/>
-      <w:numFmt w:val="lowerLetter"/>
-      <w:lvlText w:val="%5."/>
+      <w:numFmt w:val="bullet"/>
+      <w:lvlText w:val="○"/>
       <w:lvlJc w:val="left"/>
       <w:pPr>
         <w:ind w:left="3600" w:hanging="360"/>
@@ -1421,9 +1454,9 @@
     </w:lvl>
     <w:lvl w:ilvl="5">
       <w:start w:val="1"/>
-      <w:numFmt w:val="lowerRoman"/>
-      <w:lvlText w:val="%6."/>
-      <w:lvlJc w:val="right"/>
+      <w:numFmt w:val="bullet"/>
+      <w:lvlText w:val="■"/>
+      <w:lvlJc w:val="left"/>
       <w:pPr>
         <w:ind w:left="4320" w:hanging="360"/>
       </w:pPr>
@@ -1433,8 +1466,8 @@
     </w:lvl>
     <w:lvl w:ilvl="6">
       <w:start w:val="1"/>
-      <w:numFmt w:val="decimal"/>
-      <w:lvlText w:val="%7."/>
+      <w:numFmt w:val="bullet"/>
+      <w:lvlText w:val="●"/>
       <w:lvlJc w:val="left"/>
       <w:pPr>
         <w:ind w:left="5040" w:hanging="360"/>
@@ -1445,8 +1478,8 @@
     </w:lvl>
     <w:lvl w:ilvl="7">
       <w:start w:val="1"/>
-      <w:numFmt w:val="lowerLetter"/>
-      <w:lvlText w:val="%8."/>
+      <w:numFmt w:val="bullet"/>
+      <w:lvlText w:val="○"/>
       <w:lvlJc w:val="left"/>
       <w:pPr>
         <w:ind w:left="5760" w:hanging="360"/>
@@ -1457,9 +1490,9 @@
     </w:lvl>
     <w:lvl w:ilvl="8">
       <w:start w:val="1"/>
-      <w:numFmt w:val="lowerRoman"/>
-      <w:lvlText w:val="%9."/>
-      <w:lvlJc w:val="right"/>
+      <w:numFmt w:val="bullet"/>
+      <w:lvlText w:val="■"/>
+      <w:lvlJc w:val="left"/>
       <w:pPr>
         <w:ind w:left="6480" w:hanging="360"/>
       </w:pPr>
@@ -1471,8 +1504,8 @@
   <w:abstractNum w:abstractNumId="9">
     <w:lvl w:ilvl="0">
       <w:start w:val="1"/>
-      <w:numFmt w:val="decimal"/>
-      <w:lvlText w:val="%1."/>
+      <w:numFmt w:val="bullet"/>
+      <w:lvlText w:val="●"/>
       <w:lvlJc w:val="left"/>
       <w:pPr>
         <w:ind w:left="720" w:hanging="360"/>
@@ -1483,8 +1516,8 @@
     </w:lvl>
     <w:lvl w:ilvl="1">
       <w:start w:val="1"/>
-      <w:numFmt w:val="lowerLetter"/>
-      <w:lvlText w:val="%2."/>
+      <w:numFmt w:val="bullet"/>
+      <w:lvlText w:val="○"/>
       <w:lvlJc w:val="left"/>
       <w:pPr>
         <w:ind w:left="1440" w:hanging="360"/>
@@ -1495,9 +1528,9 @@
     </w:lvl>
     <w:lvl w:ilvl="2">
       <w:start w:val="1"/>
-      <w:numFmt w:val="lowerRoman"/>
-      <w:lvlText w:val="%3."/>
-      <w:lvlJc w:val="right"/>
+      <w:numFmt w:val="bullet"/>
+      <w:lvlText w:val="■"/>
+      <w:lvlJc w:val="left"/>
       <w:pPr>
         <w:ind w:left="2160" w:hanging="360"/>
       </w:pPr>
@@ -1507,8 +1540,8 @@
     </w:lvl>
     <w:lvl w:ilvl="3">
       <w:start w:val="1"/>
-      <w:numFmt w:val="decimal"/>
-      <w:lvlText w:val="%4."/>
+      <w:numFmt w:val="bullet"/>
+      <w:lvlText w:val="●"/>
       <w:lvlJc w:val="left"/>
       <w:pPr>
         <w:ind w:left="2880" w:hanging="360"/>
@@ -1519,8 +1552,8 @@
     </w:lvl>
     <w:lvl w:ilvl="4">
       <w:start w:val="1"/>
-      <w:numFmt w:val="lowerLetter"/>
-      <w:lvlText w:val="%5."/>
+      <w:numFmt w:val="bullet"/>
+      <w:lvlText w:val="○"/>
       <w:lvlJc w:val="left"/>
       <w:pPr>
         <w:ind w:left="3600" w:hanging="360"/>
@@ -1531,9 +1564,9 @@
     </w:lvl>
     <w:lvl w:ilvl="5">
       <w:start w:val="1"/>
-      <w:numFmt w:val="lowerRoman"/>
-      <w:lvlText w:val="%6."/>
-      <w:lvlJc w:val="right"/>
+      <w:numFmt w:val="bullet"/>
+      <w:lvlText w:val="■"/>
+      <w:lvlJc w:val="left"/>
       <w:pPr>
         <w:ind w:left="4320" w:hanging="360"/>
       </w:pPr>
@@ -1543,8 +1576,8 @@
     </w:lvl>
     <w:lvl w:ilvl="6">
       <w:start w:val="1"/>
-      <w:numFmt w:val="decimal"/>
-      <w:lvlText w:val="%7."/>
+      <w:numFmt w:val="bullet"/>
+      <w:lvlText w:val="●"/>
       <w:lvlJc w:val="left"/>
       <w:pPr>
         <w:ind w:left="5040" w:hanging="360"/>
@@ -1555,8 +1588,8 @@
     </w:lvl>
     <w:lvl w:ilvl="7">
       <w:start w:val="1"/>
-      <w:numFmt w:val="lowerLetter"/>
-      <w:lvlText w:val="%8."/>
+      <w:numFmt w:val="bullet"/>
+      <w:lvlText w:val="○"/>
       <w:lvlJc w:val="left"/>
       <w:pPr>
         <w:ind w:left="5760" w:hanging="360"/>
@@ -1567,9 +1600,9 @@
     </w:lvl>
     <w:lvl w:ilvl="8">
       <w:start w:val="1"/>
-      <w:numFmt w:val="lowerRoman"/>
-      <w:lvlText w:val="%9."/>
-      <w:lvlJc w:val="right"/>
+      <w:numFmt w:val="bullet"/>
+      <w:lvlText w:val="■"/>
+      <w:lvlJc w:val="left"/>
       <w:pPr>
         <w:ind w:left="6480" w:hanging="360"/>
       </w:pPr>

</xml_diff>